<commit_message>
Incident template: fix footer typo
Co-Authored-By: Claude Opus 5.5 <noreply@anthropic.com>
Claude-Session: https://claude.ai/code/session_01YaYSqzX5zCZ3Z3emkoJWPy
</commit_message>
<xml_diff>
--- a/apps-script-incident/templates/ISI_Incident_Report_Template.docx
+++ b/apps-script-incident/templates/ISI_Incident_Report_Template.docx
@@ -4133,7 +4133,7 @@
                                     <w:sz w:val="14"/>
                                     <w:szCs w:val="14"/>
                                   </w:rPr>
-                                  <w:t xml:space="preserve">WAREHOUSE &amp; LOGISGICS | </w:t>
+                                  <w:t xml:space="preserve">WAREHOUSE &amp; LOGISTICS | </w:t>
                                 </w:r>
                                 <w:r>
                                   <w:rPr>
@@ -4219,7 +4219,7 @@
                               <w:sz w:val="14"/>
                               <w:szCs w:val="14"/>
                             </w:rPr>
-                            <w:t xml:space="preserve">WAREHOUSE &amp; LOGISGICS | </w:t>
+                            <w:t xml:space="preserve">WAREHOUSE &amp; LOGISTICS | </w:t>
                           </w:r>
                           <w:r>
                             <w:rPr>

</xml_diff>

<commit_message>
Incident template: plain-text footer
Co-Authored-By: Claude Opus 5.5 <noreply@anthropic.com>
Claude-Session: https://claude.ai/code/session_01YaYSqzX5zCZ3Z3emkoJWPy
</commit_message>
<xml_diff>
--- a/apps-script-incident/templates/ISI_Incident_Report_Template.docx
+++ b/apps-script-incident/templates/ISI_Incident_Report_Template.docx
@@ -3989,267 +3989,29 @@
   <w:p>
     <w:pPr>
       <w:pStyle w:val="Footer"/>
+      <w:pBdr>
+        <w:top w:val="single" w:sz="4" w:space="2" w:color="011E41"/>
+      </w:pBdr>
+      <w:tabs>
+        <w:tab w:val="clear" w:pos="4680"/>
+        <w:tab w:val="clear" w:pos="9360"/>
+      </w:tabs>
+      <w:jc w:val="right"/>
+      <w:rPr>
+        <w:rFonts w:ascii="MiSans Khmer Doc" w:hAnsi="MiSans Khmer Doc" w:cs="MiSans Khmer Doc"/>
+        <w:color w:val="011E41"/>
+        <w:sz w:val="14"/>
+        <w:szCs w:val="14"/>
+      </w:rPr>
     </w:pPr>
     <w:r>
       <w:rPr>
-        <w:noProof/>
+        <w:rFonts w:ascii="MiSans Khmer Doc" w:hAnsi="MiSans Khmer Doc" w:cs="MiSans Khmer Doc"/>
+        <w:color w:val="011E41"/>
+        <w:sz w:val="14"/>
+        <w:szCs w:val="14"/>
       </w:rPr>
-      <mc:AlternateContent>
-        <mc:Choice Requires="wpg">
-          <w:drawing>
-            <wp:anchor distT="0" distB="0" distL="114300" distR="114300" simplePos="0" relativeHeight="251659264" behindDoc="0" locked="0" layoutInCell="1" allowOverlap="1" wp14:anchorId="52D0FA3D" wp14:editId="361CCE0D">
-              <wp:simplePos x="0" y="0"/>
-              <wp:positionH relativeFrom="page">
-                <wp:align>right</wp:align>
-              </wp:positionH>
-              <wp:positionV relativeFrom="bottomMargin">
-                <wp:align>center</wp:align>
-              </wp:positionV>
-              <wp:extent cx="6172200" cy="274320"/>
-              <wp:effectExtent l="0" t="0" r="0" b="0"/>
-              <wp:wrapNone/>
-              <wp:docPr id="164" name="Group 174"/>
-              <wp:cNvGraphicFramePr/>
-              <a:graphic xmlns:a="http://schemas.openxmlformats.org/drawingml/2006/main">
-                <a:graphicData uri="http://schemas.microsoft.com/office/word/2010/wordprocessingGroup">
-                  <wpg:wgp>
-                    <wpg:cNvGrpSpPr/>
-                    <wpg:grpSpPr>
-                      <a:xfrm>
-                        <a:off x="0" y="0"/>
-                        <a:ext cx="6172200" cy="274320"/>
-                        <a:chOff x="0" y="0"/>
-                        <a:chExt cx="6172200" cy="274320"/>
-                      </a:xfrm>
-                    </wpg:grpSpPr>
-                    <wps:wsp>
-                      <wps:cNvPr id="165" name="Rectangle 165"/>
-                      <wps:cNvSpPr/>
-                      <wps:spPr>
-                        <a:xfrm>
-                          <a:off x="228600" y="0"/>
-                          <a:ext cx="5943600" cy="274320"/>
-                        </a:xfrm>
-                        <a:prstGeom prst="rect">
-                          <a:avLst/>
-                        </a:prstGeom>
-                        <a:solidFill>
-                          <a:schemeClr val="bg1">
-                            <a:alpha val="0"/>
-                          </a:schemeClr>
-                        </a:solidFill>
-                        <a:ln>
-                          <a:noFill/>
-                        </a:ln>
-                      </wps:spPr>
-                      <wps:style>
-                        <a:lnRef idx="2">
-                          <a:schemeClr val="accent1">
-                            <a:shade val="50000"/>
-                          </a:schemeClr>
-                        </a:lnRef>
-                        <a:fillRef idx="1">
-                          <a:schemeClr val="accent1"/>
-                        </a:fillRef>
-                        <a:effectRef idx="0">
-                          <a:schemeClr val="accent1"/>
-                        </a:effectRef>
-                        <a:fontRef idx="minor">
-                          <a:schemeClr val="lt1"/>
-                        </a:fontRef>
-                      </wps:style>
-                      <wps:bodyPr rot="0" spcFirstLastPara="0" vertOverflow="overflow" horzOverflow="overflow" vert="horz" wrap="square" lIns="91440" tIns="45720" rIns="91440" bIns="45720" numCol="1" spcCol="0" rtlCol="0" fromWordArt="0" anchor="ctr" anchorCtr="0" forceAA="0" compatLnSpc="1">
-                        <a:prstTxWarp prst="textNoShape">
-                          <a:avLst/>
-                        </a:prstTxWarp>
-                        <a:noAutofit/>
-                      </wps:bodyPr>
-                    </wps:wsp>
-                    <wps:wsp>
-                      <wps:cNvPr id="166" name="Text Box 166"/>
-                      <wps:cNvSpPr txBox="1"/>
-                      <wps:spPr>
-                        <a:xfrm>
-                          <a:off x="0" y="9525"/>
-                          <a:ext cx="5943600" cy="239395"/>
-                        </a:xfrm>
-                        <a:prstGeom prst="rect">
-                          <a:avLst/>
-                        </a:prstGeom>
-                        <a:noFill/>
-                        <a:ln w="6350">
-                          <a:noFill/>
-                        </a:ln>
-                        <a:effectLst/>
-                      </wps:spPr>
-                      <wps:style>
-                        <a:lnRef idx="0">
-                          <a:schemeClr val="accent1"/>
-                        </a:lnRef>
-                        <a:fillRef idx="0">
-                          <a:schemeClr val="accent1"/>
-                        </a:fillRef>
-                        <a:effectRef idx="0">
-                          <a:schemeClr val="accent1"/>
-                        </a:effectRef>
-                        <a:fontRef idx="minor">
-                          <a:schemeClr val="dk1"/>
-                        </a:fontRef>
-                      </wps:style>
-                      <wps:txbx>
-                        <w:txbxContent>
-                          <w:p>
-                            <w:pPr>
-                              <w:pStyle w:val="Footer"/>
-                              <w:tabs>
-                                <w:tab w:val="clear" w:pos="4680"/>
-                                <w:tab w:val="clear" w:pos="9360"/>
-                              </w:tabs>
-                              <w:jc w:val="right"/>
-                              <w:rPr>
-                                <w:sz w:val="8"/>
-                                <w:szCs w:val="18"/>
-                              </w:rPr>
-                            </w:pPr>
-                            <w:sdt>
-                              <w:sdtPr>
-                                <w:rPr>
-                                  <w:rFonts w:ascii="MiSans Khmer Doc" w:hAnsi="MiSans Khmer Doc" w:cs="MiSans Khmer Doc"/>
-                                  <w:color w:val="011E41"/>
-                                  <w:sz w:val="14"/>
-                                  <w:szCs w:val="14"/>
-                                </w:rPr>
-                                <w:alias w:val="Title"/>
-                                <w:tag w:val=""/>
-                                <w:id w:val="-2000573687"/>
-                                <w:dataBinding w:prefixMappings="xmlns:ns0='http://purl.org/dc/elements/1.1/' xmlns:ns1='http://schemas.openxmlformats.org/package/2006/metadata/core-properties' " w:xpath="/ns1:coreProperties[1]/ns0:title[1]" w:storeItemID="{6C3C8BC8-F283-45AE-878A-BAB7291924A1}"/>
-                                <w:text/>
-                              </w:sdtPr>
-                              <w:sdtContent>
-                                <w:r>
-                                  <w:rPr>
-                                    <w:rFonts w:ascii="MiSans Khmer Doc" w:hAnsi="MiSans Khmer Doc" w:cs="MiSans Khmer Doc"/>
-                                    <w:color w:val="011E41"/>
-                                    <w:sz w:val="14"/>
-                                    <w:szCs w:val="14"/>
-                                  </w:rPr>
-                                  <w:t xml:space="preserve">WAREHOUSE &amp; LOGISTICS | </w:t>
-                                </w:r>
-                                <w:r>
-                                  <w:rPr>
-                                    <w:rFonts w:ascii="MiSans Khmer Doc" w:hAnsi="MiSans Khmer Doc" w:cs="MiSans Khmer Doc"/>
-                                    <w:color w:val="011E41"/>
-                                    <w:sz w:val="14"/>
-                                    <w:szCs w:val="14"/>
-                                  </w:rPr>
-                                  <w:t>INCIDENT &amp; NEAR MISS REPORT</w:t>
-                                </w:r>
-                                <w:r>
-                                  <w:rPr>
-                                    <w:rFonts w:ascii="MiSans Khmer Doc" w:hAnsi="MiSans Khmer Doc" w:cs="MiSans Khmer Doc"/>
-                                    <w:color w:val="011E41"/>
-                                    <w:sz w:val="14"/>
-                                    <w:szCs w:val="14"/>
-                                  </w:rPr>
-                                  <w:t xml:space="preserve"> |</w:t>
-                                </w:r>
-                              </w:sdtContent>
-                            </w:sdt>
-                          </w:p>
-                        </w:txbxContent>
-                      </wps:txbx>
-                      <wps:bodyPr rot="0" spcFirstLastPara="0" vertOverflow="overflow" horzOverflow="overflow" vert="horz" wrap="square" lIns="0" tIns="45720" rIns="0" bIns="45720" numCol="1" spcCol="0" rtlCol="0" fromWordArt="0" anchor="t" anchorCtr="0" forceAA="0" compatLnSpc="1">
-                        <a:prstTxWarp prst="textNoShape">
-                          <a:avLst/>
-                        </a:prstTxWarp>
-                        <a:spAutoFit/>
-                      </wps:bodyPr>
-                    </wps:wsp>
-                  </wpg:wgp>
-                </a:graphicData>
-              </a:graphic>
-            </wp:anchor>
-          </w:drawing>
-        </mc:Choice>
-        <mc:Fallback>
-          <w:pict>
-            <v:group w14:anchorId="52D0FA3D" id="Group 174" o:spid="_x0000_s1026" style="position:absolute;margin-left:434.8pt;margin-top:0;width:486pt;height:21.6pt;z-index:251659264;mso-position-horizontal:right;mso-position-horizontal-relative:page;mso-position-vertical:center;mso-position-vertical-relative:bottom-margin-area" coordsize="61722,2743" o:gfxdata="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">
-              <v:rect id="Rectangle 165" o:spid="_x0000_s1027" style="position:absolute;left:2286;width:59436;height:2743;visibility:visible;mso-wrap-style:square;v-text-anchor:middle" o:gfxdata="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" fillcolor="white [3212]" stroked="f" strokeweight="1.5pt">
-                <v:fill opacity="0"/>
-              </v:rect>
-              <v:shapetype id="_x0000_t202" coordsize="21600,21600" o:spt="202" path="m,l,21600r21600,l21600,xe">
-                <v:stroke joinstyle="miter"/>
-                <v:path gradientshapeok="t" o:connecttype="rect"/>
-              </v:shapetype>
-              <v:shape id="Text Box 166" o:spid="_x0000_s1028" type="#_x0000_t202" style="position:absolute;top:95;width:59436;height:2394;visibility:visible;mso-wrap-style:square;v-text-anchor:top" o:gfxdata="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" filled="f" stroked="f" strokeweight=".5pt">
-                <v:textbox style="mso-fit-shape-to-text:t" inset="0,,0">
-                  <w:txbxContent>
-                    <w:p>
-                      <w:pPr>
-                        <w:pStyle w:val="Footer"/>
-                        <w:tabs>
-                          <w:tab w:val="clear" w:pos="4680"/>
-                          <w:tab w:val="clear" w:pos="9360"/>
-                        </w:tabs>
-                        <w:jc w:val="right"/>
-                        <w:rPr>
-                          <w:sz w:val="8"/>
-                          <w:szCs w:val="18"/>
-                        </w:rPr>
-                      </w:pPr>
-                      <w:sdt>
-                        <w:sdtPr>
-                          <w:rPr>
-                            <w:rFonts w:ascii="MiSans Khmer Doc" w:hAnsi="MiSans Khmer Doc" w:cs="MiSans Khmer Doc"/>
-                            <w:color w:val="011E41"/>
-                            <w:sz w:val="14"/>
-                            <w:szCs w:val="14"/>
-                          </w:rPr>
-                          <w:alias w:val="Title"/>
-                          <w:tag w:val=""/>
-                          <w:id w:val="-2000573687"/>
-                          <w:dataBinding w:prefixMappings="xmlns:ns0='http://purl.org/dc/elements/1.1/' xmlns:ns1='http://schemas.openxmlformats.org/package/2006/metadata/core-properties' " w:xpath="/ns1:coreProperties[1]/ns0:title[1]" w:storeItemID="{6C3C8BC8-F283-45AE-878A-BAB7291924A1}"/>
-                          <w:text/>
-                        </w:sdtPr>
-                        <w:sdtContent>
-                          <w:r>
-                            <w:rPr>
-                              <w:rFonts w:ascii="MiSans Khmer Doc" w:hAnsi="MiSans Khmer Doc" w:cs="MiSans Khmer Doc"/>
-                              <w:color w:val="011E41"/>
-                              <w:sz w:val="14"/>
-                              <w:szCs w:val="14"/>
-                            </w:rPr>
-                            <w:t xml:space="preserve">WAREHOUSE &amp; LOGISTICS | </w:t>
-                          </w:r>
-                          <w:r>
-                            <w:rPr>
-                              <w:rFonts w:ascii="MiSans Khmer Doc" w:hAnsi="MiSans Khmer Doc" w:cs="MiSans Khmer Doc"/>
-                              <w:color w:val="011E41"/>
-                              <w:sz w:val="14"/>
-                              <w:szCs w:val="14"/>
-                            </w:rPr>
-                            <w:t>INCIDENT &amp; NEAR MISS REPORT</w:t>
-                          </w:r>
-                          <w:r>
-                            <w:rPr>
-                              <w:rFonts w:ascii="MiSans Khmer Doc" w:hAnsi="MiSans Khmer Doc" w:cs="MiSans Khmer Doc"/>
-                              <w:color w:val="011E41"/>
-                              <w:sz w:val="14"/>
-                              <w:szCs w:val="14"/>
-                            </w:rPr>
-                            <w:t xml:space="preserve"> |</w:t>
-                          </w:r>
-                        </w:sdtContent>
-                      </w:sdt>
-                    </w:p>
-                  </w:txbxContent>
-                </v:textbox>
-              </v:shape>
-              <w10:wrap anchorx="page" anchory="margin"/>
-            </v:group>
-          </w:pict>
-        </mc:Fallback>
-      </mc:AlternateContent>
+      <w:t xml:space="preserve">WAREHOUSE &amp; LOGISTICS | INCIDENT &amp; NEAR MISS REPORT</w:t>
     </w:r>
   </w:p>
 </w:ftr>

</xml_diff>